<commit_message>
PROFANE ATTACK v1.6: Bach's Toccata in D minor under the title
The opening of J.S. Bach's Toccata in D minor BWV 565 (16 notes, about
6.5 s, DATA lines 990-994) plays while PROFANE ATTACK is on the display,
before CONQUER THE PLACES 0-9! (line 60 split into 60 and 62). New tape
recording (5043 bytes without REM lines); instructions_v1.6 updated.

Co-Authored-By: Claude Opus 5.5 <noreply@anthropic.com>
Claude-Session: https://claude.ai/code/session_014MnrG7cc1Hws3poqmcDFnM
</commit_message>
<xml_diff>
--- a/instructions_v1.6.docx
+++ b/instructions_v1.6.docx
@@ -319,7 +319,7 @@
         <w:rPr>
           <w:lang w:val="en-GB"/>
         </w:rPr>
-        <w:t xml:space="preserve"> with a RAM module (CE-151 or larger). The recording holds the program without its REM lines (4893 bytes); with its variables it needs about 5.5 KB of memory, so it does not fit into a PC-1500 or PC-2 without a module.</w:t>
+        <w:t xml:space="preserve"> with a RAM module (CE-151 or larger). The recording holds the program without its REM lines (5043 bytes); with its variables it needs about 5.5 KB of memory, so it does not fit into a PC-1500 or PC-2 without a module.</w:t>
       </w:r>
     </w:p>
     <w:p>
@@ -583,7 +583,7 @@
         <w:rPr>
           <w:lang w:val="en-GB"/>
         </w:rPr>
-        <w:t xml:space="preserve"> while it prepares the places, then its title, then </w:t>
+        <w:t xml:space="preserve"> while it prepares the places, then its title while it plays the opening of J.S. Bach’s Toccata in D minor, then </w:t>
       </w:r>
       <w:r>
         <w:rPr>

</xml_diff>

<commit_message>
PROFANE ATTACK v1.6: Toccata in two phrases, GAME OVER  Cathodics win!
- the Toccata is now two phrases: DATA 990-991 and 992-994; the title
  plays both, the game-over screen plays only the second one while the
  treasure (or satisfaction) is on the display
- GAME OVER  Cathodics win! (25 characters, one line) replaces
  =GAME OVER= CC wins
- new tape recording (5082 bytes without REM lines); instructions_v1.6
  updated

Co-Authored-By: Claude Opus 5.5 <noreply@anthropic.com>
Claude-Session: https://claude.ai/code/session_014MnrG7cc1Hws3poqmcDFnM
</commit_message>
<xml_diff>
--- a/instructions_v1.6.docx
+++ b/instructions_v1.6.docx
@@ -319,7 +319,7 @@
         <w:rPr>
           <w:lang w:val="en-GB"/>
         </w:rPr>
-        <w:t xml:space="preserve"> with a RAM module (CE-151 or larger). The recording holds the program without its REM lines (5043 bytes); with its variables it needs about 5.5 KB of memory, so it does not fit into a PC-1500 or PC-2 without a module.</w:t>
+        <w:t xml:space="preserve"> with a RAM module (CE-151 or larger). The recording holds the program without its REM lines (5082 bytes); with its variables it needs about 5.5 KB of memory, so it does not fit into a PC-1500 or PC-2 without a module.</w:t>
       </w:r>
     </w:p>
     <w:p>
@@ -4169,7 +4169,7 @@
           <w:rFonts w:ascii="Courier New" w:eastAsia="Courier New" w:hAnsi="Courier New" w:cs="Courier New"/>
           <w:lang w:val="en-GB"/>
         </w:rPr>
-        <w:t>=GAME OVER= CC wins</w:t>
+        <w:t xml:space="preserve">GAME OVER  Cathodics win!</w:t>
       </w:r>
       <w:r>
         <w:rPr>
@@ -4207,7 +4207,7 @@
         <w:rPr>
           <w:lang w:val="en-GB"/>
         </w:rPr>
-        <w:t xml:space="preserve"> if you have not conquered any.</w:t>
+        <w:t xml:space="preserve"> if you have not conquered any. Meanwhile the second phrase of Bach’s Toccata plays.</w:t>
       </w:r>
     </w:p>
     <w:p>
@@ -5663,7 +5663,7 @@
           <w:rFonts w:ascii="Courier New" w:eastAsia="Courier New" w:hAnsi="Courier New" w:cs="Courier New"/>
           <w:lang w:val="en-GB"/>
         </w:rPr>
-        <w:t>=GAME OVER= CC wins</w:t>
+        <w:t xml:space="preserve">GAME OVER  Cathodics win!</w:t>
       </w:r>
       <w:r>
         <w:rPr>

</xml_diff>

<commit_message>
PROFANE ATTACK v1.6: Lourdes 5 relics and 400 gold; author's texts checked
- Lourdes (place 0) now starts with 5 relics and 400 gold (line 47)
- the author's new texts kept; two did not fit the 26-character display:
  CONQUER THE PLACES OF FAITH (27) -> CONQUER PLACES OF FAITH, and the
  win line with RELICS (up to 27) -> two screens: g GOLD, r RELICS and
  c INVERTED CROSSES
- YOU HAVE: spaces between the numbers and MERC/JIHAD restored
- line 480 (whole Toccata after YOU WON WITH CATHODICS!) kept as the
  author wrote it, with spaces around GOSUB 850
- new tape recording (5139 bytes without REM lines); instructions_v1.6
  updated

Co-Authored-By: Claude Opus 5.5 <noreply@anthropic.com>
Claude-Session: https://claude.ai/code/session_014MnrG7cc1Hws3poqmcDFnM
</commit_message>
<xml_diff>
--- a/instructions_v1.6.docx
+++ b/instructions_v1.6.docx
@@ -319,7 +319,7 @@
         <w:rPr>
           <w:lang w:val="en-GB"/>
         </w:rPr>
-        <w:t xml:space="preserve"> with a RAM module (CE-151 or larger). The recording holds the program without its REM lines (5082 bytes); with its variables it needs about 5.5 KB of memory, so it does not fit into a PC-1500 or PC-2 without a module.</w:t>
+        <w:t xml:space="preserve"> with a RAM module (CE-151 or larger). The recording holds the program without its REM lines (5139 bytes); with its variables it needs about 5.5 KB of memory, so it does not fit into a PC-1500 or PC-2 without a module.</w:t>
       </w:r>
     </w:p>
     <w:p>
@@ -590,7 +590,7 @@
           <w:rFonts w:ascii="Courier New" w:eastAsia="Courier New" w:hAnsi="Courier New" w:cs="Courier New"/>
           <w:lang w:val="en-GB"/>
         </w:rPr>
-        <w:t>CONQUER THE PLACES 0-9!</w:t>
+        <w:t>CONQUER PLACES OF FAITH</w:t>
       </w:r>
       <w:r>
         <w:rPr>
@@ -2115,7 +2115,7 @@
               <w:jc w:val="right"/>
             </w:pPr>
             <w:r>
-              <w:t>0</w:t>
+              <w:t>5</w:t>
             </w:r>
           </w:p>
         </w:tc>
@@ -2141,7 +2141,7 @@
               <w:jc w:val="right"/>
             </w:pPr>
             <w:r>
-              <w:t>0</w:t>
+              <w:t>400</w:t>
             </w:r>
           </w:p>
         </w:tc>
@@ -3948,7 +3948,23 @@
           <w:rFonts w:ascii="Courier New" w:eastAsia="Courier New" w:hAnsi="Courier New" w:cs="Courier New"/>
           <w:lang w:val="en-GB"/>
         </w:rPr>
-        <w:t>g GOLD r REL c CROS</w:t>
+        <w:t>g GOLD, r RELICS</w:t>
+      </w:r>
+    </w:p>
+    <w:p>
+      <w:pPr>
+        <w:spacing w:after="40"/>
+        <w:ind w:left="567"/>
+        <w:rPr>
+          <w:lang w:val="en-GB"/>
+        </w:rPr>
+      </w:pPr>
+      <w:r>
+        <w:rPr>
+          <w:rFonts w:ascii="Courier New" w:eastAsia="Courier New" w:hAnsi="Courier New" w:cs="Courier New"/>
+          <w:lang w:val="en-GB"/>
+        </w:rPr>
+        <w:t>c INVERTED CROSSES</w:t>
       </w:r>
     </w:p>
     <w:p>
@@ -4005,7 +4021,7 @@
           <w:rFonts w:ascii="Courier New" w:eastAsia="Courier New" w:hAnsi="Courier New" w:cs="Courier New"/>
           <w:lang w:val="en-GB"/>
         </w:rPr>
-        <w:t>barrel of holy water</w:t>
+        <w:t>barrel of Holy Water</w:t>
       </w:r>
       <w:r>
         <w:rPr>
@@ -4169,26 +4185,20 @@
           <w:rFonts w:ascii="Courier New" w:eastAsia="Courier New" w:hAnsi="Courier New" w:cs="Courier New"/>
           <w:lang w:val="en-GB"/>
         </w:rPr>
-        <w:t xml:space="preserve">GAME OVER  Cathodics win!</w:t>
-      </w:r>
-      <w:r>
-        <w:rPr>
-          <w:lang w:val="en-GB"/>
-        </w:rPr>
-        <w:t>.</w:t>
-      </w:r>
-      <w:r>
-        <w:rPr>
-          <w:lang w:val="en-GB"/>
-        </w:rPr>
-        <w:t xml:space="preserve"> Then, two seconds later, it shows </w:t>
+        <w:t>GAME OVER! Cathodics won</w:t>
+      </w:r>
+      <w:r>
+        <w:rPr>
+          <w:lang w:val="en-GB"/>
+        </w:rPr>
+        <w:t xml:space="preserve">. Then, two seconds later, it shows </w:t>
       </w:r>
       <w:r>
         <w:rPr>
           <w:rFonts w:ascii="Courier New" w:eastAsia="Courier New" w:hAnsi="Courier New" w:cs="Courier New"/>
           <w:lang w:val="en-GB"/>
         </w:rPr>
-        <w:t xml:space="preserve">...but you have got...</w:t>
+        <w:t xml:space="preserve"> ..but you have got...</w:t>
       </w:r>
       <w:r>
         <w:rPr>
@@ -4201,7 +4211,7 @@
           <w:rFonts w:ascii="Courier New" w:eastAsia="Courier New" w:hAnsi="Courier New" w:cs="Courier New"/>
           <w:lang w:val="en-GB"/>
         </w:rPr>
-        <w:t xml:space="preserve">satisfaction</w:t>
+        <w:t xml:space="preserve">lesson in humility</w:t>
       </w:r>
       <w:r>
         <w:rPr>
@@ -5418,7 +5428,7 @@
           <w:rFonts w:ascii="Courier New" w:eastAsia="Courier New" w:hAnsi="Courier New" w:cs="Courier New"/>
           <w:lang w:val="en-GB"/>
         </w:rPr>
-        <w:t>ANTICLERICALS</w:t>
+        <w:t>ANTI</w:t>
       </w:r>
       <w:r>
         <w:rPr>
@@ -5631,13 +5641,19 @@
           <w:rFonts w:ascii="Courier New" w:eastAsia="Courier New" w:hAnsi="Courier New" w:cs="Courier New"/>
           <w:lang w:val="en-GB"/>
         </w:rPr>
-        <w:t>YOU WIN THE WAR!</w:t>
+        <w:t>YOU WON WITH CATHODICS!</w:t>
       </w:r>
       <w:r>
         <w:rPr>
           <w:lang w:val="en-GB"/>
         </w:rPr>
         <w:t>.</w:t>
+      </w:r>
+      <w:r>
+        <w:rPr>
+          <w:lang w:val="en-GB"/>
+        </w:rPr>
+        <w:t xml:space="preserve"> After ENTER the whole opening of Bach’s Toccata plays.</w:t>
       </w:r>
     </w:p>
     <w:p>
@@ -5663,7 +5679,7 @@
           <w:rFonts w:ascii="Courier New" w:eastAsia="Courier New" w:hAnsi="Courier New" w:cs="Courier New"/>
           <w:lang w:val="en-GB"/>
         </w:rPr>
-        <w:t xml:space="preserve">GAME OVER  Cathodics win!</w:t>
+        <w:t>GAME OVER! Cathodics won</w:t>
       </w:r>
       <w:r>
         <w:rPr>

</xml_diff>

<commit_message>
PROFANE ATTACK v1.6: G$ instead of KY$, 8 more militants per place
- the pressed key is kept in the fixed variable G$ instead of KY$: about
  60 bytes more free memory (37 bytes of program, 23 of variables)
- every place has 8 more militants (16 for the rich places 7-9):
  Lourdes 13, Fatima 22, Altotting 33, Santiago de C. 50, ... so the
  first places are no longer a sure win for every player
- new tape recording (5103 bytes without REM lines); instructions_v1.6:
  places table and program size updated

Co-Authored-By: Claude Opus 5.5 <noreply@anthropic.com>
Claude-Session: https://claude.ai/code/session_014MnrG7cc1Hws3poqmcDFnM
</commit_message>
<xml_diff>
--- a/instructions_v1.6.docx
+++ b/instructions_v1.6.docx
@@ -319,7 +319,7 @@
         <w:rPr>
           <w:lang w:val="en-GB"/>
         </w:rPr>
-        <w:t xml:space="preserve"> with a RAM module (CE-151 or larger). The recording holds the program without its REM lines (5139 bytes); with its variables it needs about 5.5 KB of memory, so it does not fit into a PC-1500 or PC-2 without a module.</w:t>
+        <w:t xml:space="preserve"> with a RAM module (CE-151 or larger). The recording holds the program without its REM lines (5103 bytes); with its variables it needs about 5.5 KB of memory, so it does not fit into a PC-1500 or PC-2 without a module.</w:t>
       </w:r>
     </w:p>
     <w:p>
@@ -2089,7 +2089,7 @@
               <w:jc w:val="right"/>
             </w:pPr>
             <w:r>
-              <w:t>5</w:t>
+              <w:t>13</w:t>
             </w:r>
           </w:p>
         </w:tc>
@@ -2228,7 +2228,7 @@
               <w:jc w:val="right"/>
             </w:pPr>
             <w:r>
-              <w:t>14</w:t>
+              <w:t>22</w:t>
             </w:r>
           </w:p>
         </w:tc>
@@ -2367,7 +2367,7 @@
               <w:jc w:val="right"/>
             </w:pPr>
             <w:r>
-              <w:t>25</w:t>
+              <w:t>33</w:t>
             </w:r>
           </w:p>
         </w:tc>
@@ -2506,7 +2506,7 @@
               <w:jc w:val="right"/>
             </w:pPr>
             <w:r>
-              <w:t>42</w:t>
+              <w:t>50</w:t>
             </w:r>
           </w:p>
         </w:tc>
@@ -2645,7 +2645,7 @@
               <w:jc w:val="right"/>
             </w:pPr>
             <w:r>
-              <w:t>67</w:t>
+              <w:t>75</w:t>
             </w:r>
           </w:p>
         </w:tc>
@@ -2784,7 +2784,7 @@
               <w:jc w:val="right"/>
             </w:pPr>
             <w:r>
-              <w:t>107</w:t>
+              <w:t>115</w:t>
             </w:r>
           </w:p>
         </w:tc>
@@ -2923,7 +2923,7 @@
               <w:jc w:val="right"/>
             </w:pPr>
             <w:r>
-              <w:t>174</w:t>
+              <w:t>182</w:t>
             </w:r>
           </w:p>
         </w:tc>
@@ -3065,7 +3065,7 @@
               <w:jc w:val="right"/>
             </w:pPr>
             <w:r>
-              <w:t>572</w:t>
+              <w:t>588</w:t>
             </w:r>
           </w:p>
         </w:tc>
@@ -3209,7 +3209,7 @@
               <w:jc w:val="right"/>
             </w:pPr>
             <w:r>
-              <w:t>960</w:t>
+              <w:t>976</w:t>
             </w:r>
           </w:p>
         </w:tc>
@@ -3368,7 +3368,7 @@
               <w:rPr>
                 <w:color w:val="EE0000"/>
               </w:rPr>
-              <w:t>1630</w:t>
+              <w:t>1646</w:t>
             </w:r>
           </w:p>
         </w:tc>

</xml_diff>

<commit_message>
PROFANE ATTACK v1.6: win/loss screens advance by themselves, YOU BEAT THE CATHODICS!
- after a fight the YOU WON / YOU LOST screens follow one another by
  themselves, 1.5 s each (WAIT 96), without ENTER
- the author's centred "c CROSSES" line (CURSOR 7) gets a CLS first, so
  it does not overwrite the gold/relics line
- the war-win line is now YOU BEAT THE CATHODICS!
- new tape recording (5085 bytes without REM lines); instructions_v1.6
  updated

Co-Authored-By: Claude Opus 5.5 <noreply@anthropic.com>
Claude-Session: https://claude.ai/code/session_014MnrG7cc1Hws3poqmcDFnM
</commit_message>
<xml_diff>
--- a/instructions_v1.6.docx
+++ b/instructions_v1.6.docx
@@ -319,7 +319,7 @@
         <w:rPr>
           <w:lang w:val="en-GB"/>
         </w:rPr>
-        <w:t xml:space="preserve"> with a RAM module (CE-151 or larger). The recording holds the program without its REM lines (5103 bytes); with its variables it needs about 5.5 KB of memory, so it does not fit into a PC-1500 or PC-2 without a module.</w:t>
+        <w:t xml:space="preserve"> with a RAM module (CE-151 or larger). The recording holds the program without its REM lines (5085 bytes); with its variables it needs about 5.5 KB of memory, so it does not fit into a PC-1500 or PC-2 without a module.</w:t>
       </w:r>
     </w:p>
     <w:p>
@@ -3932,7 +3932,7 @@
         <w:rPr>
           <w:lang w:val="en-GB"/>
         </w:rPr>
-        <w:t>. Press ENTER after each of these screens:</w:t>
+        <w:t>. The next screens follow by themselves, about 1.5 seconds each:</w:t>
       </w:r>
     </w:p>
     <w:p>
@@ -3964,7 +3964,7 @@
           <w:rFonts w:ascii="Courier New" w:eastAsia="Courier New" w:hAnsi="Courier New" w:cs="Courier New"/>
           <w:lang w:val="en-GB"/>
         </w:rPr>
-        <w:t>c INVERTED CROSSES</w:t>
+        <w:t>c CROSSES</w:t>
       </w:r>
     </w:p>
     <w:p>
@@ -4014,7 +4014,7 @@
         <w:rPr>
           <w:lang w:val="en-GB"/>
         </w:rPr>
-        <w:t xml:space="preserve">Shown for two seconds, then the treasure of the place, e.g. </w:t>
+        <w:t xml:space="preserve">Then the treasure of the place, e.g. </w:t>
       </w:r>
       <w:r>
         <w:rPr>
@@ -4152,7 +4152,7 @@
         <w:rPr>
           <w:lang w:val="en-GB"/>
         </w:rPr>
-        <w:t xml:space="preserve"> appears with your losses. The CC also takes some of your gold and relics: </w:t>
+        <w:t xml:space="preserve"> appears, then your losses; these screens change by themselves, about 1.5 seconds each. The CC also takes some of your gold and relics: </w:t>
       </w:r>
       <w:r>
         <w:rPr>
@@ -5641,7 +5641,7 @@
           <w:rFonts w:ascii="Courier New" w:eastAsia="Courier New" w:hAnsi="Courier New" w:cs="Courier New"/>
           <w:lang w:val="en-GB"/>
         </w:rPr>
-        <w:t>YOU WON WITH CATHODICS!</w:t>
+        <w:t>YOU BEAT THE CATHODICS!</w:t>
       </w:r>
       <w:r>
         <w:rPr>

</xml_diff>

<commit_message>
PROFANE ATTACK v1.6: ROUNDr: CC m vs YOU p, two dots after the last treasure
- round line: the number glued to ROUND and "vs" between the sides,
  e.g. ROUND2: CC 22 vs YOU 9 (longest seen in 1500 games: 26 characters)
- game over: the treasure (or lesson in humility) is shown with two dots,
  e.g. barrel of Holy Water..; to fit 26 characters the two longest names
  lose one character: St.Teresa Portable Altar, Botticelli paintings etc
- new tape recording (5107 bytes without REM lines); instructions_v1.6
  updated

Co-Authored-By: Claude Opus 5.5 <noreply@anthropic.com>
Claude-Session: https://claude.ai/code/session_014MnrG7cc1Hws3poqmcDFnM
</commit_message>
<xml_diff>
--- a/instructions_v1.6.docx
+++ b/instructions_v1.6.docx
@@ -319,7 +319,7 @@
         <w:rPr>
           <w:lang w:val="en-GB"/>
         </w:rPr>
-        <w:t xml:space="preserve"> with a RAM module (CE-151 or larger). The recording holds the program without its REM lines (5085 bytes); with its variables it needs about 5.5 KB of memory, so it does not fit into a PC-1500 or PC-2 without a module.</w:t>
+        <w:t xml:space="preserve"> with a RAM module (CE-151 or larger). The recording holds the program without its REM lines (5107 bytes); with its variables it needs about 5.5 KB of memory, so it does not fit into a PC-1500 or PC-2 without a module.</w:t>
       </w:r>
     </w:p>
     <w:p>
@@ -3858,13 +3858,13 @@
           <w:rFonts w:ascii="Courier New" w:eastAsia="Courier New" w:hAnsi="Courier New" w:cs="Courier New"/>
           <w:lang w:val="en-GB"/>
         </w:rPr>
-        <w:t>ROUND r: CC m YOU p</w:t>
-      </w:r>
-      <w:r>
-        <w:rPr>
-          <w:lang w:val="en-GB"/>
-        </w:rPr>
-        <w:t>: the round, the militants left and your people left.</w:t>
+        <w:t>ROUNDr: CC m vs YOU p</w:t>
+      </w:r>
+      <w:r>
+        <w:rPr>
+          <w:lang w:val="en-GB"/>
+        </w:rPr>
+        <w:t>: the number of the round, the militants still alive after your strike and your people still alive after theirs.</w:t>
       </w:r>
     </w:p>
     <w:p>
@@ -4211,7 +4211,7 @@
           <w:rFonts w:ascii="Courier New" w:eastAsia="Courier New" w:hAnsi="Courier New" w:cs="Courier New"/>
           <w:lang w:val="en-GB"/>
         </w:rPr>
-        <w:t xml:space="preserve">lesson in humility</w:t>
+        <w:t xml:space="preserve">lesson in humility..</w:t>
       </w:r>
       <w:r>
         <w:rPr>

</xml_diff>

<commit_message>
PROFANE ATTACK v1.6: buy on one line - PRICE p (MAX m) ? and the amount
The HOW MANY? question is gone: the amount is typed right after the
price line (new key-entry routine at lines 920-926, ENTER confirms,
any other key starts the entry again). Program 5200 bytes.

Co-Authored-By: Claude Opus 5.5 <noreply@anthropic.com>
Claude-Session: https://claude.ai/code/session_014MnrG7cc1Hws3poqmcDFnM
</commit_message>
<xml_diff>
--- a/instructions_v1.6.docx
+++ b/instructions_v1.6.docx
@@ -319,7 +319,7 @@
         <w:rPr>
           <w:lang w:val="en-GB"/>
         </w:rPr>
-        <w:t xml:space="preserve"> with a RAM module (CE-151 or larger). The recording holds the program without its REM lines (5107 bytes); with its variables it needs about 5.5 KB of memory, so it does not fit into a PC-1500 or PC-2 without a module.</w:t>
+        <w:t xml:space="preserve"> with a RAM module (CE-151 or larger). The recording holds the program without its REM lines (5200 bytes); with its variables it needs about 5.8 KB of memory, so it does not fit into a PC-1500 or PC-2 without a module.</w:t>
       </w:r>
     </w:p>
     <w:p>
@@ -1051,7 +1051,7 @@
         <w:rPr>
           <w:lang w:val="en-GB"/>
         </w:rPr>
-        <w:t>Other keys are ignored. Numbers (“HOW MANY…?”) are typed and confirmed with ENTER. A wrong number gives a beep and the question again.</w:t>
+        <w:t>Other keys are ignored. Numbers (“HOW MANY…?”, and when buying the number after the price) are typed and confirmed with ENTER. A wrong number gives a beep and the question again.</w:t>
       </w:r>
     </w:p>
     <w:p>
@@ -4759,26 +4759,26 @@
           <w:rFonts w:ascii="Courier New" w:eastAsia="Courier New" w:hAnsi="Courier New" w:cs="Courier New"/>
           <w:lang w:val="en-GB"/>
         </w:rPr>
-        <w:t>PRICE 25 (MAX 40)</w:t>
-      </w:r>
-      <w:r>
-        <w:rPr>
-          <w:lang w:val="en-GB"/>
-        </w:rPr>
-        <w:t xml:space="preserve">, and asks </w:t>
+        <w:t>PRICE 25 (MAX 40) ?</w:t>
+      </w:r>
+      <w:r>
+        <w:rPr>
+          <w:lang w:val="en-GB"/>
+        </w:rPr>
+        <w:t xml:space="preserve">. Type the number on the same line, right after the question mark, e.g. </w:t>
       </w:r>
       <w:r>
         <w:rPr>
           <w:rFonts w:ascii="Courier New" w:eastAsia="Courier New" w:hAnsi="Courier New" w:cs="Courier New"/>
           <w:lang w:val="en-GB"/>
         </w:rPr>
-        <w:t>HOW MANY?</w:t>
-      </w:r>
-      <w:r>
-        <w:rPr>
-          <w:lang w:val="en-GB"/>
-        </w:rPr>
-        <w:t>. Then the buy menu comes back: buy something else or press any other key to return to the main menu.</w:t>
+        <w:t>PRICE 25 (MAX 40) ? 12</w:t>
+      </w:r>
+      <w:r>
+        <w:rPr>
+          <w:lang w:val="en-GB"/>
+        </w:rPr>
+        <w:t xml:space="preserve">, and press ENTER (ENTER alone buys nothing). Any key other than a digit wipes the number, so you can type it again; more than you can afford gives a beep and the question again. Then the buy menu comes back: buy something else or press any other key to return to the main menu.</w:t>
       </w:r>
     </w:p>
     <w:p>

</xml_diff>

<commit_message>
PROFANE ATTACK v1.6: sell on one line, NOT ENOUGH GOLD when buying
SELL now shows PRICE p (MAX m) ? and takes the amount on the same line,
like BUY (SELL HOW MANY? is gone); both use one routine at lines
920-928. When you cannot afford even one piece, BUY beeps and shows
NOT ENOUGH GOLD for a second. Program 5176 bytes.

Co-Authored-By: Claude Opus 5.5 <noreply@anthropic.com>
Claude-Session: https://claude.ai/code/session_014MnrG7cc1Hws3poqmcDFnM
</commit_message>
<xml_diff>
--- a/instructions_v1.6.docx
+++ b/instructions_v1.6.docx
@@ -319,7 +319,7 @@
         <w:rPr>
           <w:lang w:val="en-GB"/>
         </w:rPr>
-        <w:t xml:space="preserve"> with a RAM module (CE-151 or larger). The recording holds the program without its REM lines (5200 bytes); with its variables it needs about 5.8 KB of memory, so it does not fit into a PC-1500 or PC-2 without a module.</w:t>
+        <w:t xml:space="preserve"> with a RAM module (CE-151 or larger). The recording holds the program without its REM lines (5176 bytes); with its variables it needs about 5.8 KB of memory, so it does not fit into a PC-1500 or PC-2 without a module.</w:t>
       </w:r>
     </w:p>
     <w:p>
@@ -1051,7 +1051,7 @@
         <w:rPr>
           <w:lang w:val="en-GB"/>
         </w:rPr>
-        <w:t>Other keys are ignored. Numbers (“HOW MANY…?”, and when buying the number after the price) are typed and confirmed with ENTER. A wrong number gives a beep and the question again.</w:t>
+        <w:t>Other keys are ignored. Numbers (“HOW MANY…?”, and when buying or selling the number after the price) are typed and confirmed with ENTER. A wrong number gives a beep and the question again.</w:t>
       </w:r>
     </w:p>
     <w:p>
@@ -4778,7 +4778,20 @@
         <w:rPr>
           <w:lang w:val="en-GB"/>
         </w:rPr>
-        <w:t xml:space="preserve">, and press ENTER (ENTER alone buys nothing). Any key other than a digit wipes the number, so you can type it again; more than you can afford gives a beep and the question again. Then the buy menu comes back: buy something else or press any other key to return to the main menu.</w:t>
+        <w:t xml:space="preserve">, and press ENTER (ENTER alone buys nothing). Any key other than a digit wipes the number, so you can type it again; more than you can afford gives a beep and the question again. If you cannot afford even one, the game beeps, shows </w:t>
+      </w:r>
+      <w:r>
+        <w:rPr>
+          <w:rFonts w:ascii="Courier New" w:eastAsia="Courier New" w:hAnsi="Courier New" w:cs="Courier New"/>
+          <w:lang w:val="en-GB"/>
+        </w:rPr>
+        <w:t xml:space="preserve">NOT ENOUGH GOLD</w:t>
+      </w:r>
+      <w:r>
+        <w:rPr>
+          <w:lang w:val="en-GB"/>
+        </w:rPr>
+        <w:t xml:space="preserve"> for a second and the buy menu comes back at once. After a purchase the buy menu comes back too: buy something else or press any other key to return to the main menu.</w:t>
       </w:r>
     </w:p>
     <w:p>
@@ -5294,26 +5307,13 @@
           <w:rFonts w:ascii="Courier New" w:eastAsia="Courier New" w:hAnsi="Courier New" w:cs="Courier New"/>
           <w:lang w:val="en-GB"/>
         </w:rPr>
-        <w:t xml:space="preserve">PRICE 400 (MAX 2)</w:t>
-      </w:r>
-      <w:r>
-        <w:rPr>
-          <w:lang w:val="en-GB"/>
-        </w:rPr>
-        <w:t xml:space="preserve">, and asks </w:t>
-      </w:r>
-      <w:r>
-        <w:rPr>
-          <w:rFonts w:ascii="Courier New" w:eastAsia="Courier New" w:hAnsi="Courier New" w:cs="Courier New"/>
-          <w:lang w:val="en-GB"/>
-        </w:rPr>
-        <w:t xml:space="preserve">SELL HOW MANY?</w:t>
-      </w:r>
-      <w:r>
-        <w:rPr>
-          <w:lang w:val="en-GB"/>
-        </w:rPr>
-        <w:t xml:space="preserve"> (0 sells nothing). Then it shows </w:t>
+        <w:t xml:space="preserve">PRICE 400 (MAX 2) ?</w:t>
+      </w:r>
+      <w:r>
+        <w:rPr>
+          <w:lang w:val="en-GB"/>
+        </w:rPr>
+        <w:t xml:space="preserve">. Type the number right after the question mark, as when buying, and press ENTER (ENTER alone sells nothing). Then it shows </w:t>
       </w:r>
       <w:r>
         <w:rPr>

</xml_diff>

<commit_message>
PROFANE ATTACK v1.6: shorter win screens, FIGHT RESULTS for one second
The win now shows YOU WON: g GOLD during the melody and then
r RELICS c CROSSES (the separate YOU WON!, YOU GOT: and CROSSES screens
are gone). FIGHT RESULTS waits one second instead of two; the first
round is calculated while it is on the display. Program 5141 bytes.

Co-Authored-By: Claude Opus 5.5 <noreply@anthropic.com>
Claude-Session: https://claude.ai/code/session_014MnrG7cc1Hws3poqmcDFnM
</commit_message>
<xml_diff>
--- a/instructions_v1.6.docx
+++ b/instructions_v1.6.docx
@@ -319,7 +319,7 @@
         <w:rPr>
           <w:lang w:val="en-GB"/>
         </w:rPr>
-        <w:t xml:space="preserve"> with a RAM module (CE-151 or larger). The recording holds the program without its REM lines (5176 bytes); with its variables it needs about 5.8 KB of memory, so it does not fit into a PC-1500 or PC-2 without a module.</w:t>
+        <w:t xml:space="preserve"> with a RAM module (CE-151 or larger). The recording holds the program without its REM lines (5141 bytes); with its variables it needs about 5.8 KB of memory, so it does not fit into a PC-1500 or PC-2 without a module.</w:t>
       </w:r>
     </w:p>
     <w:p>
@@ -3906,33 +3906,7 @@
         <w:rPr>
           <w:lang w:val="en-GB"/>
         </w:rPr>
-        <w:t xml:space="preserve">A triumph melody plays, then </w:t>
-      </w:r>
-      <w:r>
-        <w:rPr>
-          <w:rFonts w:ascii="Courier New" w:eastAsia="Courier New" w:hAnsi="Courier New" w:cs="Courier New"/>
-          <w:lang w:val="en-GB"/>
-        </w:rPr>
-        <w:t>YOU WON!</w:t>
-      </w:r>
-      <w:r>
-        <w:rPr>
-          <w:lang w:val="en-GB"/>
-        </w:rPr>
-        <w:t xml:space="preserve"> and </w:t>
-      </w:r>
-      <w:r>
-        <w:rPr>
-          <w:rFonts w:ascii="Courier New" w:eastAsia="Courier New" w:hAnsi="Courier New" w:cs="Courier New"/>
-          <w:lang w:val="en-GB"/>
-        </w:rPr>
-        <w:t>YOU GOT:</w:t>
-      </w:r>
-      <w:r>
-        <w:rPr>
-          <w:lang w:val="en-GB"/>
-        </w:rPr>
-        <w:t>. The next screens follow by themselves, about 1.5 seconds each:</w:t>
+        <w:t xml:space="preserve">A triumph melody plays while the first screen shows the gold you won; it stays about 1.5 seconds after the melody. The next screens follow by themselves, about 1.5 seconds each:</w:t>
       </w:r>
     </w:p>
     <w:p>
@@ -3948,7 +3922,7 @@
           <w:rFonts w:ascii="Courier New" w:eastAsia="Courier New" w:hAnsi="Courier New" w:cs="Courier New"/>
           <w:lang w:val="en-GB"/>
         </w:rPr>
-        <w:t>g GOLD, r RELICS</w:t>
+        <w:t>YOU WON: g GOLD</w:t>
       </w:r>
     </w:p>
     <w:p>
@@ -3964,7 +3938,7 @@
           <w:rFonts w:ascii="Courier New" w:eastAsia="Courier New" w:hAnsi="Courier New" w:cs="Courier New"/>
           <w:lang w:val="en-GB"/>
         </w:rPr>
-        <w:t>c CROSSES</w:t>
+        <w:t>r RELICS c CROSSES</w:t>
       </w:r>
     </w:p>
     <w:p>

</xml_diff>

<commit_message>
PROFANE ATTACK v1.6: YOU WON! <place> IS YOURS
The win screen now names the place: YOU WON! Lourdes IS YOURS. Longer
names do not fit into 26 characters, so after the melody the line moves
to the left until its end is visible. Then YOU GOT g GOLD and
r RELICS c CROSSES. The losses are kept in A, L and H instead of LA, LM
and LJ (45 bytes of variables less); the march animation counts with J.
Program 5231 bytes.

Co-Authored-By: Claude Opus 5.5 <noreply@anthropic.com>
Claude-Session: https://claude.ai/code/session_014MnrG7cc1Hws3poqmcDFnM
</commit_message>
<xml_diff>
--- a/instructions_v1.6.docx
+++ b/instructions_v1.6.docx
@@ -319,7 +319,7 @@
         <w:rPr>
           <w:lang w:val="en-GB"/>
         </w:rPr>
-        <w:t xml:space="preserve"> with a RAM module (CE-151 or larger). The recording holds the program without its REM lines (5141 bytes); with its variables it needs about 5.8 KB of memory, so it does not fit into a PC-1500 or PC-2 without a module.</w:t>
+        <w:t xml:space="preserve"> with a RAM module (CE-151 or larger). The recording holds the program without its REM lines (5231 bytes); with its variables it needs about 5.8 KB of memory, so it does not fit into a PC-1500 or PC-2 without a module.</w:t>
       </w:r>
     </w:p>
     <w:p>
@@ -3906,7 +3906,20 @@
         <w:rPr>
           <w:lang w:val="en-GB"/>
         </w:rPr>
-        <w:t xml:space="preserve">A triumph melody plays while the first screen shows the gold you won; it stays about 1.5 seconds after the melody. The next screens follow by themselves, about 1.5 seconds each:</w:t>
+        <w:t xml:space="preserve">A triumph melody plays while the first screen shows e.g. </w:t>
+      </w:r>
+      <w:r>
+        <w:rPr>
+          <w:rFonts w:ascii="Courier New" w:eastAsia="Courier New" w:hAnsi="Courier New" w:cs="Courier New"/>
+          <w:lang w:val="en-GB"/>
+        </w:rPr>
+        <w:t>YOU WON! Lourdes IS YOURS</w:t>
+      </w:r>
+      <w:r>
+        <w:rPr>
+          <w:lang w:val="en-GB"/>
+        </w:rPr>
+        <w:t xml:space="preserve">. A longer place name does not fit on the display, so after the melody the line moves to the left until you can read its end. The line stays about 1.5 seconds after the melody, and the next screens follow by themselves, about 1.5 seconds each:</w:t>
       </w:r>
     </w:p>
     <w:p>
@@ -3922,7 +3935,7 @@
           <w:rFonts w:ascii="Courier New" w:eastAsia="Courier New" w:hAnsi="Courier New" w:cs="Courier New"/>
           <w:lang w:val="en-GB"/>
         </w:rPr>
-        <w:t>YOU WON: g GOLD</w:t>
+        <w:t>YOU GOT g GOLD</w:t>
       </w:r>
     </w:p>
     <w:p>

</xml_diff>

<commit_message>
PROFANE ATTACK v1.6: ROUND1 shows both sides at full strength
The first round line now comes right after FIGHT RESULTS, before any
strike: ROUND1: CC m vs YOU p with all the militants of the place and
all your people. Every next round shows what is left after the strike,
and the last one also when your weapons kill the last militants
(CC 0 before YOU WON!). Program 5259 bytes.

Co-Authored-By: Claude Opus 5.5 <noreply@anthropic.com>
Claude-Session: https://claude.ai/code/session_014MnrG7cc1Hws3poqmcDFnM
</commit_message>
<xml_diff>
--- a/instructions_v1.6.docx
+++ b/instructions_v1.6.docx
@@ -319,7 +319,7 @@
         <w:rPr>
           <w:lang w:val="en-GB"/>
         </w:rPr>
-        <w:t xml:space="preserve"> with a RAM module (CE-151 or larger). The recording holds the program without its REM lines (5231 bytes); with its variables it needs about 5.8 KB of memory, so it does not fit into a PC-1500 or PC-2 without a module.</w:t>
+        <w:t xml:space="preserve"> with a RAM module (CE-151 or larger). The recording holds the program without its REM lines (5259 bytes); with its variables it needs about 5.8 KB of memory, so it does not fit into a PC-1500 or PC-2 without a module.</w:t>
       </w:r>
     </w:p>
     <w:p>
@@ -3851,20 +3851,72 @@
         <w:rPr>
           <w:lang w:val="en-GB"/>
         </w:rPr>
-        <w:t xml:space="preserve">After each round the game shows </w:t>
+        <w:t xml:space="preserve">On the display, the game first shows </w:t>
       </w:r>
       <w:r>
         <w:rPr>
           <w:rFonts w:ascii="Courier New" w:eastAsia="Courier New" w:hAnsi="Courier New" w:cs="Courier New"/>
           <w:lang w:val="en-GB"/>
         </w:rPr>
-        <w:t>ROUNDr: CC m vs YOU p</w:t>
-      </w:r>
-      <w:r>
-        <w:rPr>
-          <w:lang w:val="en-GB"/>
-        </w:rPr>
-        <w:t>: the number of the round, the militants still alive after your strike and your people still alive after theirs.</w:t>
+        <w:t>ROUND1: CC m vs YOU p</w:t>
+      </w:r>
+      <w:r>
+        <w:rPr>
+          <w:lang w:val="en-GB"/>
+        </w:rPr>
+        <w:t xml:space="preserve"> with both sides at full strength: the militants of the place and all your people. After every strike the next round (</w:t>
+      </w:r>
+      <w:r>
+        <w:rPr>
+          <w:rFonts w:ascii="Courier New" w:eastAsia="Courier New" w:hAnsi="Courier New" w:cs="Courier New"/>
+          <w:lang w:val="en-GB"/>
+        </w:rPr>
+        <w:t>ROUND2</w:t>
+      </w:r>
+      <w:r>
+        <w:rPr>
+          <w:lang w:val="en-GB"/>
+        </w:rPr>
+        <w:t xml:space="preserve">, </w:t>
+      </w:r>
+      <w:r>
+        <w:rPr>
+          <w:rFonts w:ascii="Courier New" w:eastAsia="Courier New" w:hAnsi="Courier New" w:cs="Courier New"/>
+          <w:lang w:val="en-GB"/>
+        </w:rPr>
+        <w:t>ROUND3</w:t>
+      </w:r>
+      <w:r>
+        <w:rPr>
+          <w:lang w:val="en-GB"/>
+        </w:rPr>
+        <w:t xml:space="preserve"> …) shows what is left: the militants still alive after your strike and your people still alive after theirs. The last round shows </w:t>
+      </w:r>
+      <w:r>
+        <w:rPr>
+          <w:rFonts w:ascii="Courier New" w:eastAsia="Courier New" w:hAnsi="Courier New" w:cs="Courier New"/>
+          <w:lang w:val="en-GB"/>
+        </w:rPr>
+        <w:t>CC 0</w:t>
+      </w:r>
+      <w:r>
+        <w:rPr>
+          <w:lang w:val="en-GB"/>
+        </w:rPr>
+        <w:t xml:space="preserve"> when you win or </w:t>
+      </w:r>
+      <w:r>
+        <w:rPr>
+          <w:rFonts w:ascii="Courier New" w:eastAsia="Courier New" w:hAnsi="Courier New" w:cs="Courier New"/>
+          <w:lang w:val="en-GB"/>
+        </w:rPr>
+        <w:t>YOU 0</w:t>
+      </w:r>
+      <w:r>
+        <w:rPr>
+          <w:lang w:val="en-GB"/>
+        </w:rPr>
+        <w:t xml:space="preserve"> when you lose.</w:t>
       </w:r>
     </w:p>
     <w:p>

</xml_diff>

<commit_message>
PROFANE ATTACK v1.6: any key after the SELL status line
The REL r MERC m JIH j screen of SELL now goes on to the sell menu
when any key is pressed, not only ENTER. Program 5262 bytes.

Co-Authored-By: Claude Opus 5.5 <noreply@anthropic.com>
Claude-Session: https://claude.ai/code/session_014MnrG7cc1Hws3poqmcDFnM
</commit_message>
<xml_diff>
--- a/instructions_v1.6.docx
+++ b/instructions_v1.6.docx
@@ -319,7 +319,7 @@
         <w:rPr>
           <w:lang w:val="en-GB"/>
         </w:rPr>
-        <w:t xml:space="preserve"> with a RAM module (CE-151 or larger). The recording holds the program without its REM lines (5259 bytes); with its variables it needs about 5.8 KB of memory, so it does not fit into a PC-1500 or PC-2 without a module.</w:t>
+        <w:t xml:space="preserve"> with a RAM module (CE-151 or larger). The recording holds the program without its REM lines (5262 bytes); with its variables it needs about 5.8 KB of memory, so it does not fit into a PC-1500 or PC-2 without a module.</w:t>
       </w:r>
     </w:p>
     <w:p>
@@ -4886,7 +4886,7 @@
         <w:rPr>
           <w:lang w:val="en-GB"/>
         </w:rPr>
-        <w:t xml:space="preserve"> (relics, mercenaries, jihadists) and waits for ENTER. Then it asks </w:t>
+        <w:t xml:space="preserve"> (relics, mercenaries, jihadists) and waits until you press any key. Then it asks </w:t>
       </w:r>
       <w:r>
         <w:rPr>

</xml_diff>

<commit_message>
PROFANE ATTACK v1.6: any key on the resources screens
R shows YOU HAVE: and then the people, the weapons and the gold and
relics, one screen at a time; any key (not only ENTER) goes on to the
next screen and after the last one back to the main menu.
Program 5284 bytes.

Co-Authored-By: Claude Opus 5.5 <noreply@anthropic.com>
Claude-Session: https://claude.ai/code/session_014MnrG7cc1Hws3poqmcDFnM
</commit_message>
<xml_diff>
--- a/instructions_v1.6.docx
+++ b/instructions_v1.6.docx
@@ -319,7 +319,7 @@
         <w:rPr>
           <w:lang w:val="en-GB"/>
         </w:rPr>
-        <w:t xml:space="preserve"> with a RAM module (CE-151 or larger). The recording holds the program without its REM lines (5262 bytes); with its variables it needs about 5.8 KB of memory, so it does not fit into a PC-1500 or PC-2 without a module.</w:t>
+        <w:t xml:space="preserve"> with a RAM module (CE-151 or larger). The recording holds the program without its REM lines (5284 bytes); with its variables it needs about 5.8 KB of memory, so it does not fit into a PC-1500 or PC-2 without a module.</w:t>
       </w:r>
     </w:p>
     <w:p>
@@ -5460,7 +5460,7 @@
         <w:rPr>
           <w:lang w:val="en-GB"/>
         </w:rPr>
-        <w:t xml:space="preserve"> press ENTER to see your people (</w:t>
+        <w:t xml:space="preserve"> the game shows your people (</w:t>
       </w:r>
       <w:r>
         <w:rPr>
@@ -5551,7 +5551,7 @@
         <w:rPr>
           <w:lang w:val="en-GB"/>
         </w:rPr>
-        <w:t>.</w:t>
+        <w:t xml:space="preserve">, one screen at a time. Press any key to see the next screen; after the last one the main menu comes back.</w:t>
       </w:r>
     </w:p>
     <w:p>

</xml_diff>

<commit_message>
PROFANE ATTACK v1.6: Hurling/Spewing screens, weaker first strike, owned place
- Between ROUND1 and ROUND2 the game shows "Hurling inv. crosses!" when
  crosses are used and "Spewing brimstones!" when brimstones are used
  (WAIT 45 each).
- The first strike of a fight is weaker: weapons hit with chance .35 in
  round 1 (militants still behind their walls), .5 from round 2 on, so a
  big place is no longer wiped out in the first round (same arsenal: 70
  instead of 100 of the 182 militants of Loreto). Simulated expert
  players now win the war in about 0-15 % of games (before 19-38 %).
- Choosing a place that is already yours goes back to WHICH PLACE.
- Memory: SP -> O, LS$(0) 32 characters, six lines merged; program 5353
  bytes, about 40 bytes left on a PC-1500A.
- Instructions (fight section, size) and the recording updated.

Co-Authored-By: Claude Opus 5.5 <noreply@anthropic.com>
Claude-Session: https://claude.ai/code/session_014MnrG7cc1Hws3poqmcDFnM
</commit_message>
<xml_diff>
--- a/instructions_v1.6.docx
+++ b/instructions_v1.6.docx
@@ -319,7 +319,7 @@
         <w:rPr>
           <w:lang w:val="en-GB"/>
         </w:rPr>
-        <w:t xml:space="preserve"> with a RAM module (CE-151 or larger). The recording holds the program without its REM lines (5284 bytes); with its variables it needs about 5.8 KB of memory, so it does not fit into a PC-1500 or PC-2 without a module.</w:t>
+        <w:t xml:space="preserve"> with a RAM module (CE-151 or larger). The recording holds the program without its REM lines (5353 bytes); with its variables it needs about 5.9 KB of memory, so it does not fit into a PC-1500 or PC-2 without a module.</w:t>
       </w:r>
     </w:p>
     <w:p>
@@ -3615,7 +3615,7 @@
         <w:rPr>
           <w:lang w:val="en-GB"/>
         </w:rPr>
-        <w:t>.</w:t>
+        <w:t xml:space="preserve"> and asks for the place again.</w:t>
       </w:r>
     </w:p>
     <w:p>
@@ -3813,7 +3813,7 @@
         <w:rPr>
           <w:lang w:val="en-GB"/>
         </w:rPr>
-        <w:t>Your side strikes first: the crosses and brimstones you chose and all your jihadists.</w:t>
+        <w:t>Your side strikes first: the crosses and brimstones you chose and all your jihadists. The first strike is the weakest, because the militants are still behind their walls; from the second round on your weapons hit more often.</w:t>
       </w:r>
     </w:p>
     <w:p>
@@ -3916,7 +3916,59 @@
         <w:rPr>
           <w:lang w:val="en-GB"/>
         </w:rPr>
-        <w:t xml:space="preserve"> when you lose.</w:t>
+        <w:t xml:space="preserve"> when you lose. Between </w:t>
+      </w:r>
+      <w:r>
+        <w:rPr>
+          <w:rFonts w:ascii="Courier New" w:eastAsia="Courier New" w:hAnsi="Courier New" w:cs="Courier New"/>
+          <w:lang w:val="en-GB"/>
+        </w:rPr>
+        <w:t>ROUND1</w:t>
+      </w:r>
+      <w:r>
+        <w:rPr>
+          <w:lang w:val="en-GB"/>
+        </w:rPr>
+        <w:t xml:space="preserve"> and </w:t>
+      </w:r>
+      <w:r>
+        <w:rPr>
+          <w:rFonts w:ascii="Courier New" w:eastAsia="Courier New" w:hAnsi="Courier New" w:cs="Courier New"/>
+          <w:lang w:val="en-GB"/>
+        </w:rPr>
+        <w:t>ROUND2</w:t>
+      </w:r>
+      <w:r>
+        <w:rPr>
+          <w:lang w:val="en-GB"/>
+        </w:rPr>
+        <w:t xml:space="preserve"> the game shows </w:t>
+      </w:r>
+      <w:r>
+        <w:rPr>
+          <w:rFonts w:ascii="Courier New" w:eastAsia="Courier New" w:hAnsi="Courier New" w:cs="Courier New"/>
+          <w:lang w:val="en-GB"/>
+        </w:rPr>
+        <w:t>Hurling inv. crosses!</w:t>
+      </w:r>
+      <w:r>
+        <w:rPr>
+          <w:lang w:val="en-GB"/>
+        </w:rPr>
+        <w:t xml:space="preserve"> when you fight with crosses and </w:t>
+      </w:r>
+      <w:r>
+        <w:rPr>
+          <w:rFonts w:ascii="Courier New" w:eastAsia="Courier New" w:hAnsi="Courier New" w:cs="Courier New"/>
+          <w:lang w:val="en-GB"/>
+        </w:rPr>
+        <w:t>Spewing brimstones!</w:t>
+      </w:r>
+      <w:r>
+        <w:rPr>
+          <w:lang w:val="en-GB"/>
+        </w:rPr>
+        <w:t xml:space="preserve"> when you fight with brimstones.</w:t>
       </w:r>
     </w:p>
     <w:p>

</xml_diff>

<commit_message>
PROFANE ATTACK v1.6: Hurling/Spewing for 1 s, FIGHTING!
- "Hurling inv. crosses!" and "Spewing brimstones!" stay 1 s (WAIT 64),
  like the ROUND lines; the WAIT of the fight (line 275) is kept, so the
  extra WAIT lines are gone.
- "FIGHT RESULTS" is now "FIGHTING!".
Program 5339 bytes, about 55 bytes left on a PC-1500A.

Co-Authored-By: Claude Opus 5.5 <noreply@anthropic.com>
Claude-Session: https://claude.ai/code/session_014MnrG7cc1Hws3poqmcDFnM
</commit_message>
<xml_diff>
--- a/instructions_v1.6.docx
+++ b/instructions_v1.6.docx
@@ -319,7 +319,7 @@
         <w:rPr>
           <w:lang w:val="en-GB"/>
         </w:rPr>
-        <w:t xml:space="preserve"> with a RAM module (CE-151 or larger). The recording holds the program without its REM lines (5356 bytes); with its variables it needs about 5.9 KB of memory, so it does not fit into a PC-1500 or PC-2 without a module.</w:t>
+        <w:t xml:space="preserve"> with a RAM module (CE-151 or larger). The recording holds the program without its REM lines (5339 bytes); with its variables it needs about 5.9 KB of memory, so it does not fit into a PC-1500 or PC-2 without a module.</w:t>
       </w:r>
     </w:p>
     <w:p>
@@ -3760,13 +3760,13 @@
           <w:rFonts w:ascii="Courier New" w:eastAsia="Courier New" w:hAnsi="Courier New" w:cs="Courier New"/>
           <w:lang w:val="en-GB"/>
         </w:rPr>
-        <w:t>FIGHT RESULTS</w:t>
-      </w:r>
-      <w:r>
-        <w:rPr>
-          <w:lang w:val="en-GB"/>
-        </w:rPr>
-        <w:t>.</w:t>
+        <w:t>FIGHTING!</w:t>
+      </w:r>
+      <w:r>
+        <w:rPr>
+          <w:lang w:val="en-GB"/>
+        </w:rPr>
+        <w:t xml:space="preserve"> and the rounds begin.</w:t>
       </w:r>
     </w:p>
     <w:p>

</xml_diff>

<commit_message>
PROFANE ATTACK v1.6: 6x more anticlericals, conquered places break free
- Anticlericals: for every 300 gold of a conquered place 1-3 join
  (Z = Z + RND (3)) instead of one with chance 1/3: about 6 times more.
- Once a rich place (7, 8 or 9) has been won (D = 1), after every fight
  with chance 1/3 one of your places (never the one just fought for)
  breaks free: "<place> broke free!". Its militants and relics are
  restored by the new subroutine 880, which also sets up the places at
  the start; its gold is computed from the relics.
- Memory: the gold array GA is gone (gold of the chosen place in U), the
  melody reads T, Q so D is free for the flag. Program 5448 bytes,
  about 30 bytes left on a PC-1500A.
- Instructions (new "A place breaks free"), README and recording updated.

Co-Authored-By: Claude Opus 5.5 <noreply@anthropic.com>
Claude-Session: https://claude.ai/code/session_014MnrG7cc1Hws3poqmcDFnM
</commit_message>
<xml_diff>
--- a/instructions_v1.6.docx
+++ b/instructions_v1.6.docx
@@ -319,7 +319,7 @@
         <w:rPr>
           <w:lang w:val="en-GB"/>
         </w:rPr>
-        <w:t xml:space="preserve"> with a RAM module (CE-151 or larger). The recording holds the program without its REM lines (5339 bytes); with its variables it needs about 5.9 KB of memory, so it does not fit into a PC-1500 or PC-2 without a module.</w:t>
+        <w:t xml:space="preserve"> with a RAM module (CE-151 or larger). The recording holds the program without its REM lines (5448 bytes); with its variables it needs about 5.9 KB of memory, so it does not fit into a PC-1500 or PC-2 without a module.</w:t>
       </w:r>
     </w:p>
     <w:p>
@@ -4188,7 +4188,7 @@
         <w:rPr>
           <w:lang w:val="en-GB"/>
         </w:rPr>
-        <w:t xml:space="preserve">A quarter of the militants of the place join you as mercenaries. The more gold a place gives you, the more new anticlericals may join you, because Cathodic people were outraged by how much gold was stored there.</w:t>
+        <w:t xml:space="preserve">A quarter of the militants of the place join you as mercenaries. The more gold a place gives you, the more new anticlericals join you, because Cathodic people were outraged by how much gold was stored there.</w:t>
       </w:r>
     </w:p>
     <w:p>
@@ -4309,6 +4309,47 @@
           <w:lang w:val="en-GB"/>
         </w:rPr>
         <w:t xml:space="preserve"> if you have not conquered any. Meanwhile the second phrase of Bach’s Toccata plays.</w:t>
+      </w:r>
+    </w:p>
+    <w:p>
+      <w:pPr>
+        <w:pStyle w:val="Nagwek2"/>
+        <w:rPr>
+          <w:lang w:val="en-GB"/>
+        </w:rPr>
+      </w:pPr>
+      <w:r>
+        <w:rPr>
+          <w:lang w:val="en-GB"/>
+        </w:rPr>
+        <w:t>A place breaks free</w:t>
+      </w:r>
+    </w:p>
+    <w:p>
+      <w:pPr>
+        <w:spacing w:after="120"/>
+        <w:rPr>
+          <w:lang w:val="en-GB"/>
+        </w:rPr>
+      </w:pPr>
+      <w:r>
+        <w:rPr>
+          <w:lang w:val="en-GB"/>
+        </w:rPr>
+        <w:t xml:space="preserve">Once you have conquered one of the rich places (7, 8 or 9), the Cathodics start to fight back. From time to time, after a fight, one of your places rises against you, for example </w:t>
+      </w:r>
+      <w:r>
+        <w:rPr>
+          <w:rFonts w:ascii="Courier New" w:eastAsia="Courier New" w:hAnsi="Courier New" w:cs="Courier New"/>
+          <w:lang w:val="en-GB"/>
+        </w:rPr>
+        <w:t>Loreto broke free!</w:t>
+      </w:r>
+      <w:r>
+        <w:rPr>
+          <w:lang w:val="en-GB"/>
+        </w:rPr>
+        <w:t xml:space="preserve"> It is never the place you have just fought for. Its militants, relics and gold are back as at the start of the game, and you can conquer it again. To win the war, all ten places must be yours at the same time.</w:t>
       </w:r>
     </w:p>
     <w:p>

</xml_diff>

<commit_message>
PROFANE ATTACK v1.6: places break free on the way to the main menu
- The break-free check now runs every time the game enters the main menu
  (line 100; after a fight, shopping, selling, ...), with chance 1/15,
  once a rich place (7-9) has been won. The freed place (never the one of
  the last fight) is announced with "<place> broke free!" while phrase 2
  of Bach's Toccata plays, then WAIT 64, then the menu. The old check
  after every fight is gone.
- Memory: the relics array RA is gone too; gold U and relics Y of the
  chosen place are computed in lines 222-223 (same values as before).
  Program 5478 bytes, about 90 bytes left on a PC-1500A.
- Instructions and recording updated.

Co-Authored-By: Claude Opus 5.5 <noreply@anthropic.com>
Claude-Session: https://claude.ai/code/session_014MnrG7cc1Hws3poqmcDFnM
</commit_message>
<xml_diff>
--- a/instructions_v1.6.docx
+++ b/instructions_v1.6.docx
@@ -319,7 +319,7 @@
         <w:rPr>
           <w:lang w:val="en-GB"/>
         </w:rPr>
-        <w:t xml:space="preserve"> with a RAM module (CE-151 or larger). The recording holds the program without its REM lines (5448 bytes); with its variables it needs about 5.9 KB of memory, so it does not fit into a PC-1500 or PC-2 without a module.</w:t>
+        <w:t xml:space="preserve"> with a RAM module (CE-151 or larger). The recording holds the program without its REM lines (5478 bytes); with its variables it needs about 5.9 KB of memory, so it does not fit into a PC-1500 or PC-2 without a module.</w:t>
       </w:r>
     </w:p>
     <w:p>
@@ -4336,7 +4336,7 @@
         <w:rPr>
           <w:lang w:val="en-GB"/>
         </w:rPr>
-        <w:t xml:space="preserve">Once you have conquered one of the rich places (7, 8 or 9), the Cathodics start to fight back. From time to time, after a fight, one of your places rises against you, for example </w:t>
+        <w:t xml:space="preserve">Once you have conquered one of the rich places (7, 8 or 9), the Cathodics start to fight back. From time to time, on the way back to the main menu (after a fight, after shopping and so on), one of your places rises against you: the game shows e.g. </w:t>
       </w:r>
       <w:r>
         <w:rPr>
@@ -4349,7 +4349,7 @@
         <w:rPr>
           <w:lang w:val="en-GB"/>
         </w:rPr>
-        <w:t xml:space="preserve"> It is never the place you have just fought for. Its militants, relics and gold are back as at the start of the game, and you can conquer it again. To win the war, all ten places must be yours at the same time.</w:t>
+        <w:t xml:space="preserve"> while the second phrase of Bach’s Toccata plays, and then the main menu. It is never the place of your last fight. Its militants, relics and gold are back as at the start of the game, and you can conquer it again. To win the war, all ten places must be yours at the same time.</w:t>
       </w:r>
     </w:p>
     <w:p>

</xml_diff>

<commit_message>
PROFANE ATTACK v1.6: blinking messages, centred FIGHTING!, save to win
- "<place> broke free!" and YOU LOST! blink three times after their
  melody (new subroutine 845-846); YOU LOST! and FIGHTING! are centred.
- Relics per place are now 4 x N + 5 (Lourdes 5, Fatima 9 ... Loreto 29,
  rich places 33, 37, 41) instead of being doubled at places 7-9: the
  first places give more, the rich ones not enough for the next one.
  Simulated on the BASIC listing: a thrifty player wins about 64% of
  the games (was 24%), one who uses up all gold in every fight 0-0.5%,
  failing at places 7, 8 and 9.
- Shorter strings by the author (title, treasures); 5497 bytes.
- New recording, instructions (places table, tips) and README.

Co-Authored-By: Claude Opus 5.5 <noreply@anthropic.com>
Claude-Session: https://claude.ai/code/session_014MnrG7cc1Hws3poqmcDFnM
</commit_message>
<xml_diff>
--- a/instructions_v1.6.docx
+++ b/instructions_v1.6.docx
@@ -250,7 +250,7 @@
         <w:rPr>
           <w:lang w:val="en-GB"/>
         </w:rPr>
-        <w:t>: they start with twice as many militants, relics and gold. The richest of all is the Vatican (place 9). Every place also hides its own treasure.</w:t>
+        <w:t>: they start with twice as many militants and twice as much gold, but not with twice as many relics, so what one of them gives you is not enough to conquer the next one. The richest of all is the Vatican (place 9). Every place also hides its own treasure.</w:t>
       </w:r>
     </w:p>
     <w:p>
@@ -319,7 +319,7 @@
         <w:rPr>
           <w:lang w:val="en-GB"/>
         </w:rPr>
-        <w:t xml:space="preserve"> with a RAM module (CE-151 or larger). The recording holds the program without its REM lines (5478 bytes); with its variables it needs about 5.9 KB of memory, so it does not fit into a PC-1500 or PC-2 without a module.</w:t>
+        <w:t xml:space="preserve"> with a RAM module (CE-151 or larger). The recording holds the program without its REM lines (5497 bytes); with its variables it needs about 5.9 KB of memory, so it does not fit into a PC-1500 or PC-2 without a module.</w:t>
       </w:r>
     </w:p>
     <w:p>
@@ -483,7 +483,7 @@
         <w:rPr>
           <w:lang w:val="en-GB"/>
         </w:rPr>
-        <w:t>, about 6 minutes). If the program does not load, try again with another volume.</w:t>
+        <w:t>, about 7 minutes). If the program does not load, try again with another volume.</w:t>
       </w:r>
     </w:p>
     <w:p>
@@ -577,7 +577,7 @@
           <w:rFonts w:ascii="Courier New" w:eastAsia="Courier New" w:hAnsi="Courier New" w:cs="Courier New"/>
           <w:lang w:val="en-GB"/>
         </w:rPr>
-        <w:t>Starting...</w:t>
+        <w:t>Starting..</w:t>
       </w:r>
       <w:r>
         <w:rPr>
@@ -590,7 +590,7 @@
           <w:rFonts w:ascii="Courier New" w:eastAsia="Courier New" w:hAnsi="Courier New" w:cs="Courier New"/>
           <w:lang w:val="en-GB"/>
         </w:rPr>
-        <w:t>CONQUER PLACES OF FAITH</w:t>
+        <w:t>CONQUER BASTIONS OF FAITH</w:t>
       </w:r>
       <w:r>
         <w:rPr>
@@ -2254,7 +2254,7 @@
               <w:jc w:val="right"/>
             </w:pPr>
             <w:r>
-              <w:t>3</w:t>
+              <w:t>9</w:t>
             </w:r>
           </w:p>
         </w:tc>
@@ -2393,7 +2393,7 @@
               <w:jc w:val="right"/>
             </w:pPr>
             <w:r>
-              <w:t>6</w:t>
+              <w:t>13</w:t>
             </w:r>
           </w:p>
         </w:tc>
@@ -2532,7 +2532,7 @@
               <w:jc w:val="right"/>
             </w:pPr>
             <w:r>
-              <w:t>9</w:t>
+              <w:t>17</w:t>
             </w:r>
           </w:p>
         </w:tc>
@@ -2671,7 +2671,7 @@
               <w:jc w:val="right"/>
             </w:pPr>
             <w:r>
-              <w:t>12</w:t>
+              <w:t>21</w:t>
             </w:r>
           </w:p>
         </w:tc>
@@ -2810,7 +2810,7 @@
               <w:jc w:val="right"/>
             </w:pPr>
             <w:r>
-              <w:t>15</w:t>
+              <w:t>25</w:t>
             </w:r>
           </w:p>
         </w:tc>
@@ -2949,7 +2949,7 @@
               <w:jc w:val="right"/>
             </w:pPr>
             <w:r>
-              <w:t>18</w:t>
+              <w:t>29</w:t>
             </w:r>
           </w:p>
         </w:tc>
@@ -3092,7 +3092,7 @@
               <w:jc w:val="right"/>
             </w:pPr>
             <w:r>
-              <w:t>42</w:t>
+              <w:t>33</w:t>
             </w:r>
           </w:p>
         </w:tc>
@@ -3236,7 +3236,7 @@
               <w:jc w:val="right"/>
             </w:pPr>
             <w:r>
-              <w:t>48</w:t>
+              <w:t>37</w:t>
             </w:r>
           </w:p>
         </w:tc>
@@ -3400,7 +3400,7 @@
               <w:rPr>
                 <w:color w:val="EE0000"/>
               </w:rPr>
-              <w:t>54</w:t>
+              <w:t>41</w:t>
             </w:r>
           </w:p>
         </w:tc>
@@ -3583,7 +3583,7 @@
           <w:rFonts w:ascii="Courier New" w:eastAsia="Courier New" w:hAnsi="Courier New" w:cs="Courier New"/>
           <w:lang w:val="en-GB"/>
         </w:rPr>
-        <w:t>42 MILITANTS</w:t>
+        <w:t>50 MILITANTS</w:t>
       </w:r>
       <w:r>
         <w:rPr>
@@ -3596,7 +3596,7 @@
           <w:rFonts w:ascii="Courier New" w:eastAsia="Courier New" w:hAnsi="Courier New" w:cs="Courier New"/>
           <w:lang w:val="en-GB"/>
         </w:rPr>
-        <w:t>9 RELICS, 900 GOLD</w:t>
+        <w:t>17 RELICS, 900 GOLD</w:t>
       </w:r>
       <w:r>
         <w:rPr>
@@ -3753,7 +3753,7 @@
         <w:rPr>
           <w:lang w:val="en-GB"/>
         </w:rPr>
-        <w:t xml:space="preserve">Your army and the militants march twice from both sides of the display; each time they meet, the game beeps. Then it shows </w:t>
+        <w:t xml:space="preserve">Your army and the militants march twice from both sides of the display; each time they meet, the game beeps. Then </w:t>
       </w:r>
       <w:r>
         <w:rPr>
@@ -3766,7 +3766,7 @@
         <w:rPr>
           <w:lang w:val="en-GB"/>
         </w:rPr>
-        <w:t xml:space="preserve"> and the rounds begin.</w:t>
+        <w:t xml:space="preserve"> appears in the middle of the display and the rounds begin.</w:t>
       </w:r>
     </w:p>
     <w:p>
@@ -4228,12 +4228,6 @@
       </w:pPr>
       <w:r>
         <w:rPr>
-          <w:lang w:val="en-GB"/>
-        </w:rPr>
-        <w:t xml:space="preserve">A falling melody plays and </w:t>
-      </w:r>
-      <w:r>
-        <w:rPr>
           <w:rFonts w:ascii="Courier New" w:eastAsia="Courier New" w:hAnsi="Courier New" w:cs="Courier New"/>
           <w:lang w:val="en-GB"/>
         </w:rPr>
@@ -4243,7 +4237,7 @@
         <w:rPr>
           <w:lang w:val="en-GB"/>
         </w:rPr>
-        <w:t xml:space="preserve"> appears, then your losses; these screens change by themselves, about 1.5 seconds each. The CC also takes some of your gold and relics: </w:t>
+        <w:t xml:space="preserve"> appears in the middle of the display while a falling melody plays, and then it blinks three times. Your losses follow; these screens change by themselves, about 1.5 seconds each. The CC also takes some of your gold and relics: </w:t>
       </w:r>
       <w:r>
         <w:rPr>
@@ -4349,7 +4343,7 @@
         <w:rPr>
           <w:lang w:val="en-GB"/>
         </w:rPr>
-        <w:t xml:space="preserve"> while the second phrase of Bach’s Toccata plays, and then the main menu. It is never the place of your last fight. Its militants, relics and gold are back as at the start of the game, and you can conquer it again. To win the war, all ten places must be yours at the same time.</w:t>
+        <w:t xml:space="preserve"> while the second phrase of Bach’s Toccata plays; then the message blinks three times and the main menu comes back. It is never the place of your last fight. Its militants, relics and gold are back as at the start of the game, and you can conquer it again. To win the war, all ten places must be yours at the same time.</w:t>
       </w:r>
     </w:p>
     <w:p>
@@ -5882,7 +5876,7 @@
         <w:rPr>
           <w:lang w:val="en-GB"/>
         </w:rPr>
-        <w:t>Save gold for the richest places 7, 8 and 9: each of them is a big step up.</w:t>
+        <w:t>Save gold and relics from the first places for the rich places 7, 8 and 9: each of them is a big step up, and what one of them gives you is not enough for the next one. If you use up all your gold in every fight, you will not get through Weltenburg and the Vatican.</w:t>
       </w:r>
     </w:p>
     <w:p>

</xml_diff>

<commit_message>
PROFANE ATTACK v1.6: treasure only once, break-free from place 6
- D now remembers every place ever won (bit N). The treasure screen
  (AND ALSO YOU GOT:) appears only the first time a place is conquered,
  not when you win back a place that broke free.
- Places break free once Loreto (place 6) or a higher place is yours
  (D > 63.5), chance 1/10 on the way to the main menu.
- IF ... LET instead of IF ... THEN LET everywhere (2 bytes each), which
  pays for the change: 5514 bytes, 54 bytes of memory to spare.
- Simulated on the BASIC listing: 3369 won fights, 281 of them won back,
  treasure never shown twice; no place broke free before place 6 was
  won. Rule-of-thumb player about 54% of the games, spenders 0-1%.
- Instructions, README and recording updated.

Co-Authored-By: Claude Opus 5.5 <noreply@anthropic.com>
Claude-Session: https://claude.ai/code/session_014MnrG7cc1Hws3poqmcDFnM
</commit_message>
<xml_diff>
--- a/instructions_v1.6.docx
+++ b/instructions_v1.6.docx
@@ -319,7 +319,7 @@
         <w:rPr>
           <w:lang w:val="en-GB"/>
         </w:rPr>
-        <w:t xml:space="preserve"> with a RAM module (CE-151 or larger). The recording holds the program without its REM lines (5537 bytes); with its variables it needs about 5.9 KB of memory, so it does not fit into a PC-1500 or PC-2 without a module.</w:t>
+        <w:t xml:space="preserve"> with a RAM module (CE-151 or larger). The recording holds the program without its REM lines (5514 bytes); with its variables it needs about 5.9 KB of memory, so it does not fit into a PC-1500 or PC-2 without a module.</w:t>
       </w:r>
     </w:p>
     <w:p>
@@ -4118,7 +4118,7 @@
         <w:rPr>
           <w:lang w:val="en-GB"/>
         </w:rPr>
-        <w:t xml:space="preserve"> at Lourdes. Every place has its own treasure; it is a trophy and does not change your resources.</w:t>
+        <w:t xml:space="preserve"> at Lourdes. Every place has its own treasure; it is a trophy and does not change your resources. You get it only the first time you conquer the place: when you win back a place that broke free, this screen is left out.</w:t>
       </w:r>
     </w:p>
     <w:p>
@@ -4330,7 +4330,7 @@
         <w:rPr>
           <w:lang w:val="en-GB"/>
         </w:rPr>
-        <w:t xml:space="preserve">Once you have conquered Avila (place 5) or a higher place, the Cathodics start to fight back. From time to time, on the way back to the main menu (after a fight, after shopping and so on), one of your places rises against you: the game shows e.g. </w:t>
+        <w:t xml:space="preserve">Once you have conquered Loreto (place 6) or a higher place, the Cathodics start to fight back. From time to time, on the way back to the main menu (after a fight, after shopping and so on), one of your places rises against you: the game shows e.g. </w:t>
       </w:r>
       <w:r>
         <w:rPr>

</xml_diff>

<commit_message>
PROFANE ATTACK v1.6: instructions and recording match the new strings
The author's string changes (HOW MANY INV.CROSSES?, NO WEAPONS!,
ENTER=FIGHT 3=RETREAT, >> Hurling.../>> Spewing...) are now also in the
instructions and in the recording, so that v1.6 can be archived as a
consistent whole.

Co-Authored-By: Claude Opus 5.5 <noreply@anthropic.com>
Claude-Session: https://claude.ai/code/session_014MnrG7cc1Hws3poqmcDFnM
</commit_message>
<xml_diff>
--- a/instructions_v1.6.docx
+++ b/instructions_v1.6.docx
@@ -3635,7 +3635,7 @@
           <w:rFonts w:ascii="Courier New" w:eastAsia="Courier New" w:hAnsi="Courier New" w:cs="Courier New"/>
           <w:lang w:val="en-GB"/>
         </w:rPr>
-        <w:t>HOW MANY CROSSES?</w:t>
+        <w:t>HOW MANY INV.CROSSES?</w:t>
       </w:r>
       <w:r>
         <w:rPr>
@@ -3674,7 +3674,7 @@
           <w:rFonts w:ascii="Courier New" w:eastAsia="Courier New" w:hAnsi="Courier New" w:cs="Courier New"/>
           <w:lang w:val="en-GB"/>
         </w:rPr>
-        <w:t>NO WEAPONS: NO CHANCE!</w:t>
+        <w:t>NO WEAPONS!</w:t>
       </w:r>
       <w:r>
         <w:rPr>
@@ -3700,7 +3700,7 @@
           <w:rFonts w:ascii="Courier New" w:eastAsia="Courier New" w:hAnsi="Courier New" w:cs="Courier New"/>
           <w:lang w:val="en-GB"/>
         </w:rPr>
-        <w:t>ENTER=FIGHT  3=RETREAT</w:t>
+        <w:t>ENTER=FIGHT 3=RETREAT</w:t>
       </w:r>
       <w:r>
         <w:rPr>
@@ -3949,7 +3949,7 @@
           <w:rFonts w:ascii="Courier New" w:eastAsia="Courier New" w:hAnsi="Courier New" w:cs="Courier New"/>
           <w:lang w:val="en-GB"/>
         </w:rPr>
-        <w:t>Hurling inv. crosses!</w:t>
+        <w:t>&gt;&gt; Hurling inv. crosses!</w:t>
       </w:r>
       <w:r>
         <w:rPr>
@@ -3962,7 +3962,7 @@
           <w:rFonts w:ascii="Courier New" w:eastAsia="Courier New" w:hAnsi="Courier New" w:cs="Courier New"/>
           <w:lang w:val="en-GB"/>
         </w:rPr>
-        <w:t>Spewing brimstones!</w:t>
+        <w:t>&gt;&gt; Spewing brimstones!</w:t>
       </w:r>
       <w:r>
         <w:rPr>

</xml_diff>

<commit_message>
PROFANE ATTACK v1.6: instructions and recording match the latest strings
The author's latest changes (RESOUR in the menu, BRIMSTONES?, Merc. hurl
inv. crosses!, Satanists spew brimstones!, NO ONE LEFT!, ALL BASTIONS ARE
YOURS!, QUIT (Y/N)?, relic price 40 * RND (20) + 200) are now in the
instructions (5508 bytes) and in the recording.

Co-Authored-By: Claude Opus 5.5 <noreply@anthropic.com>
Claude-Session: https://claude.ai/code/session_014MnrG7cc1Hws3poqmcDFnM
</commit_message>
<xml_diff>
--- a/instructions_v1.6.docx
+++ b/instructions_v1.6.docx
@@ -319,7 +319,7 @@
         <w:rPr>
           <w:lang w:val="en-GB"/>
         </w:rPr>
-        <w:t xml:space="preserve"> with a RAM module (CE-151 or larger). The recording holds the program without its REM lines (5514 bytes); with its variables it needs about 5.9 KB of memory, so it does not fit into a PC-1500 or PC-2 without a module.</w:t>
+        <w:t xml:space="preserve"> with a RAM module (CE-151 or larger). The recording holds the program without its REM lines (5508 bytes); with its variables it needs about 5.9 KB of memory, so it does not fit into a PC-1500 or PC-2 without a module.</w:t>
       </w:r>
     </w:p>
     <w:p>
@@ -612,7 +612,7 @@
           <w:rFonts w:ascii="Courier New" w:eastAsia="Courier New" w:hAnsi="Courier New" w:cs="Courier New"/>
           <w:lang w:val="en-GB"/>
         </w:rPr>
-        <w:t>FIGHT/BUY/SELL/RES/END?</w:t>
+        <w:t>FIGHT/BUY/SELL/RESOUR/END?</w:t>
       </w:r>
     </w:p>
     <w:p>
@@ -3648,7 +3648,7 @@
           <w:rFonts w:ascii="Courier New" w:eastAsia="Courier New" w:hAnsi="Courier New" w:cs="Courier New"/>
           <w:lang w:val="en-GB"/>
         </w:rPr>
-        <w:t>HOW MANY BRIMSTONES?</w:t>
+        <w:t>BRIMSTONES?</w:t>
       </w:r>
       <w:r>
         <w:rPr>
@@ -3949,7 +3949,7 @@
           <w:rFonts w:ascii="Courier New" w:eastAsia="Courier New" w:hAnsi="Courier New" w:cs="Courier New"/>
           <w:lang w:val="en-GB"/>
         </w:rPr>
-        <w:t>&gt;&gt; Hurling inv. crosses!</w:t>
+        <w:t>Merc. hurl inv. crosses!</w:t>
       </w:r>
       <w:r>
         <w:rPr>
@@ -3962,7 +3962,7 @@
           <w:rFonts w:ascii="Courier New" w:eastAsia="Courier New" w:hAnsi="Courier New" w:cs="Courier New"/>
           <w:lang w:val="en-GB"/>
         </w:rPr>
-        <w:t>&gt;&gt; Spewing brimstones!</w:t>
+        <w:t>Satanists spew brimstones!</w:t>
       </w:r>
       <w:r>
         <w:rPr>
@@ -4257,7 +4257,7 @@
           <w:rFonts w:ascii="Courier New" w:eastAsia="Courier New" w:hAnsi="Courier New" w:cs="Courier New"/>
           <w:lang w:val="en-GB"/>
         </w:rPr>
-        <w:t>NO PEOPLE LEFT!</w:t>
+        <w:t>NO ONE LEFT!</w:t>
       </w:r>
       <w:r>
         <w:rPr>
@@ -5687,7 +5687,7 @@
           <w:rFonts w:ascii="Courier New" w:eastAsia="Courier New" w:hAnsi="Courier New" w:cs="Courier New"/>
           <w:lang w:val="en-GB"/>
         </w:rPr>
-        <w:t>QUIT GAME (Y/N)?</w:t>
+        <w:t>QUIT (Y/N)?</w:t>
       </w:r>
       <w:r>
         <w:rPr>
@@ -5754,7 +5754,7 @@
           <w:rFonts w:ascii="Courier New" w:eastAsia="Courier New" w:hAnsi="Courier New" w:cs="Courier New"/>
           <w:lang w:val="en-GB"/>
         </w:rPr>
-        <w:t>ALL PLACES ARE YOURS!</w:t>
+        <w:t>ALL BASTIONS ARE YOURS!</w:t>
       </w:r>
       <w:r>
         <w:rPr>

</xml_diff>